<commit_message>
Updated the instructions w/ python installations
</commit_message>
<xml_diff>
--- a/INSTRUCTIONS - Project Time Tracker.docx
+++ b/INSTRUCTIONS - Project Time Tracker.docx
@@ -33,6 +33,14 @@
     </w:p>
     <w:sdt>
       <w:sdtPr>
+        <w:rPr>
+          <w:rFonts w:ascii="Calibri" w:eastAsiaTheme="minorEastAsia" w:hAnsi="Calibri" w:cstheme="minorBidi"/>
+          <w:b w:val="0"/>
+          <w:bCs w:val="0"/>
+          <w:color w:val="auto"/>
+          <w:sz w:val="21"/>
+          <w:szCs w:val="22"/>
+        </w:rPr>
         <w:id w:val="812220710"/>
         <w:docPartObj>
           <w:docPartGallery w:val="Table of Contents"/>
@@ -41,11 +49,7 @@
       </w:sdtPr>
       <w:sdtEndPr>
         <w:rPr>
-          <w:rFonts w:ascii="Calibri" w:eastAsiaTheme="minorEastAsia" w:hAnsi="Calibri" w:cstheme="minorBidi"/>
           <w:noProof/>
-          <w:color w:val="auto"/>
-          <w:sz w:val="21"/>
-          <w:szCs w:val="22"/>
         </w:rPr>
       </w:sdtEndPr>
       <w:sdtContent>
@@ -81,7 +85,7 @@
           <w:r>
             <w:fldChar w:fldCharType="separate"/>
           </w:r>
-          <w:hyperlink w:anchor="_Toc234885126" w:history="1">
+          <w:hyperlink w:anchor="_Toc234896715" w:history="1">
             <w:r>
               <w:rPr>
                 <w:rStyle w:val="Hyperlink"/>
@@ -108,7 +112,7 @@
                 <w:noProof/>
                 <w:webHidden/>
               </w:rPr>
-              <w:instrText xml:space="preserve"> PAGEREF _Toc234885126 \h </w:instrText>
+              <w:instrText xml:space="preserve"> PAGEREF _Toc234896715 \h </w:instrText>
             </w:r>
             <w:r>
               <w:rPr>
@@ -128,7 +132,7 @@
                 <w:noProof/>
                 <w:webHidden/>
               </w:rPr>
-              <w:t>1</w:t>
+              <w:t>2</w:t>
             </w:r>
             <w:r>
               <w:rPr>
@@ -154,13 +158,13 @@
               <w14:ligatures w14:val="standardContextual"/>
             </w:rPr>
           </w:pPr>
-          <w:hyperlink w:anchor="_Toc234885127" w:history="1">
+          <w:hyperlink w:anchor="_Toc234896716" w:history="1">
             <w:r>
               <w:rPr>
                 <w:rStyle w:val="Hyperlink"/>
                 <w:noProof/>
               </w:rPr>
-              <w:t>Installation Guide:</w:t>
+              <w:t>Python Installation Guide:</w:t>
             </w:r>
             <w:r>
               <w:rPr>
@@ -181,7 +185,7 @@
                 <w:noProof/>
                 <w:webHidden/>
               </w:rPr>
-              <w:instrText xml:space="preserve"> PAGEREF _Toc234885127 \h </w:instrText>
+              <w:instrText xml:space="preserve"> PAGEREF _Toc234896716 \h </w:instrText>
             </w:r>
             <w:r>
               <w:rPr>
@@ -227,13 +231,13 @@
               <w14:ligatures w14:val="standardContextual"/>
             </w:rPr>
           </w:pPr>
-          <w:hyperlink w:anchor="_Toc234885128" w:history="1">
+          <w:hyperlink w:anchor="_Toc234896717" w:history="1">
             <w:r>
               <w:rPr>
                 <w:rStyle w:val="Hyperlink"/>
                 <w:noProof/>
               </w:rPr>
-              <w:t>Requirements:</w:t>
+              <w:t>1. Check if You Have Python Installed</w:t>
             </w:r>
             <w:r>
               <w:rPr>
@@ -254,7 +258,7 @@
                 <w:noProof/>
                 <w:webHidden/>
               </w:rPr>
-              <w:instrText xml:space="preserve"> PAGEREF _Toc234885128 \h </w:instrText>
+              <w:instrText xml:space="preserve"> PAGEREF _Toc234896717 \h </w:instrText>
             </w:r>
             <w:r>
               <w:rPr>
@@ -300,13 +304,13 @@
               <w14:ligatures w14:val="standardContextual"/>
             </w:rPr>
           </w:pPr>
-          <w:hyperlink w:anchor="_Toc234885129" w:history="1">
+          <w:hyperlink w:anchor="_Toc234896718" w:history="1">
             <w:r>
               <w:rPr>
                 <w:rStyle w:val="Hyperlink"/>
                 <w:noProof/>
               </w:rPr>
-              <w:t>1. Copy the Program Folder to Your Computer</w:t>
+              <w:t>2. Install Python</w:t>
             </w:r>
             <w:r>
               <w:rPr>
@@ -327,7 +331,80 @@
                 <w:noProof/>
                 <w:webHidden/>
               </w:rPr>
-              <w:instrText xml:space="preserve"> PAGEREF _Toc234885129 \h </w:instrText>
+              <w:instrText xml:space="preserve"> PAGEREF _Toc234896718 \h </w:instrText>
+            </w:r>
+            <w:r>
+              <w:rPr>
+                <w:noProof/>
+                <w:webHidden/>
+              </w:rPr>
+            </w:r>
+            <w:r>
+              <w:rPr>
+                <w:noProof/>
+                <w:webHidden/>
+              </w:rPr>
+              <w:fldChar w:fldCharType="separate"/>
+            </w:r>
+            <w:r>
+              <w:rPr>
+                <w:noProof/>
+                <w:webHidden/>
+              </w:rPr>
+              <w:t>2</w:t>
+            </w:r>
+            <w:r>
+              <w:rPr>
+                <w:noProof/>
+                <w:webHidden/>
+              </w:rPr>
+              <w:fldChar w:fldCharType="end"/>
+            </w:r>
+          </w:hyperlink>
+        </w:p>
+        <w:p>
+          <w:pPr>
+            <w:pStyle w:val="TOC1"/>
+            <w:tabs>
+              <w:tab w:val="right" w:leader="dot" w:pos="9782"/>
+            </w:tabs>
+            <w:rPr>
+              <w:rFonts w:asciiTheme="minorHAnsi" w:hAnsiTheme="minorHAnsi"/>
+              <w:noProof/>
+              <w:kern w:val="2"/>
+              <w:sz w:val="24"/>
+              <w:szCs w:val="24"/>
+              <w14:ligatures w14:val="standardContextual"/>
+            </w:rPr>
+          </w:pPr>
+          <w:hyperlink w:anchor="_Toc234896719" w:history="1">
+            <w:r>
+              <w:rPr>
+                <w:rStyle w:val="Hyperlink"/>
+                <w:noProof/>
+              </w:rPr>
+              <w:t>Program Installation Guide:</w:t>
+            </w:r>
+            <w:r>
+              <w:rPr>
+                <w:noProof/>
+                <w:webHidden/>
+              </w:rPr>
+              <w:tab/>
+            </w:r>
+            <w:r>
+              <w:rPr>
+                <w:noProof/>
+                <w:webHidden/>
+              </w:rPr>
+              <w:fldChar w:fldCharType="begin"/>
+            </w:r>
+            <w:r>
+              <w:rPr>
+                <w:noProof/>
+                <w:webHidden/>
+              </w:rPr>
+              <w:instrText xml:space="preserve"> PAGEREF _Toc234896719 \h </w:instrText>
             </w:r>
             <w:r>
               <w:rPr>
@@ -373,13 +450,13 @@
               <w14:ligatures w14:val="standardContextual"/>
             </w:rPr>
           </w:pPr>
-          <w:hyperlink w:anchor="_Toc234885130" w:history="1">
+          <w:hyperlink w:anchor="_Toc234896720" w:history="1">
             <w:r>
               <w:rPr>
                 <w:rStyle w:val="Hyperlink"/>
                 <w:noProof/>
               </w:rPr>
-              <w:t>2. Install the Required Libraries</w:t>
+              <w:t>Requirements:</w:t>
             </w:r>
             <w:r>
               <w:rPr>
@@ -400,7 +477,7 @@
                 <w:noProof/>
                 <w:webHidden/>
               </w:rPr>
-              <w:instrText xml:space="preserve"> PAGEREF _Toc234885130 \h </w:instrText>
+              <w:instrText xml:space="preserve"> PAGEREF _Toc234896720 \h </w:instrText>
             </w:r>
             <w:r>
               <w:rPr>
@@ -446,12 +523,158 @@
               <w14:ligatures w14:val="standardContextual"/>
             </w:rPr>
           </w:pPr>
-          <w:hyperlink w:anchor="_Toc234885131" w:history="1">
+          <w:hyperlink w:anchor="_Toc234896721" w:history="1">
             <w:r>
               <w:rPr>
                 <w:rStyle w:val="Hyperlink"/>
                 <w:noProof/>
               </w:rPr>
+              <w:t>1. Copy the Program Folder to Your Computer</w:t>
+            </w:r>
+            <w:r>
+              <w:rPr>
+                <w:noProof/>
+                <w:webHidden/>
+              </w:rPr>
+              <w:tab/>
+            </w:r>
+            <w:r>
+              <w:rPr>
+                <w:noProof/>
+                <w:webHidden/>
+              </w:rPr>
+              <w:fldChar w:fldCharType="begin"/>
+            </w:r>
+            <w:r>
+              <w:rPr>
+                <w:noProof/>
+                <w:webHidden/>
+              </w:rPr>
+              <w:instrText xml:space="preserve"> PAGEREF _Toc234896721 \h </w:instrText>
+            </w:r>
+            <w:r>
+              <w:rPr>
+                <w:noProof/>
+                <w:webHidden/>
+              </w:rPr>
+            </w:r>
+            <w:r>
+              <w:rPr>
+                <w:noProof/>
+                <w:webHidden/>
+              </w:rPr>
+              <w:fldChar w:fldCharType="separate"/>
+            </w:r>
+            <w:r>
+              <w:rPr>
+                <w:noProof/>
+                <w:webHidden/>
+              </w:rPr>
+              <w:t>2</w:t>
+            </w:r>
+            <w:r>
+              <w:rPr>
+                <w:noProof/>
+                <w:webHidden/>
+              </w:rPr>
+              <w:fldChar w:fldCharType="end"/>
+            </w:r>
+          </w:hyperlink>
+        </w:p>
+        <w:p>
+          <w:pPr>
+            <w:pStyle w:val="TOC2"/>
+            <w:tabs>
+              <w:tab w:val="right" w:leader="dot" w:pos="9782"/>
+            </w:tabs>
+            <w:rPr>
+              <w:rFonts w:asciiTheme="minorHAnsi" w:hAnsiTheme="minorHAnsi"/>
+              <w:noProof/>
+              <w:kern w:val="2"/>
+              <w:sz w:val="24"/>
+              <w:szCs w:val="24"/>
+              <w14:ligatures w14:val="standardContextual"/>
+            </w:rPr>
+          </w:pPr>
+          <w:hyperlink w:anchor="_Toc234896722" w:history="1">
+            <w:r>
+              <w:rPr>
+                <w:rStyle w:val="Hyperlink"/>
+                <w:noProof/>
+              </w:rPr>
+              <w:t>2. Install the Required Libraries</w:t>
+            </w:r>
+            <w:r>
+              <w:rPr>
+                <w:noProof/>
+                <w:webHidden/>
+              </w:rPr>
+              <w:tab/>
+            </w:r>
+            <w:r>
+              <w:rPr>
+                <w:noProof/>
+                <w:webHidden/>
+              </w:rPr>
+              <w:fldChar w:fldCharType="begin"/>
+            </w:r>
+            <w:r>
+              <w:rPr>
+                <w:noProof/>
+                <w:webHidden/>
+              </w:rPr>
+              <w:instrText xml:space="preserve"> PAGEREF _Toc234896722 \h </w:instrText>
+            </w:r>
+            <w:r>
+              <w:rPr>
+                <w:noProof/>
+                <w:webHidden/>
+              </w:rPr>
+            </w:r>
+            <w:r>
+              <w:rPr>
+                <w:noProof/>
+                <w:webHidden/>
+              </w:rPr>
+              <w:fldChar w:fldCharType="separate"/>
+            </w:r>
+            <w:r>
+              <w:rPr>
+                <w:noProof/>
+                <w:webHidden/>
+              </w:rPr>
+              <w:t>3</w:t>
+            </w:r>
+            <w:r>
+              <w:rPr>
+                <w:noProof/>
+                <w:webHidden/>
+              </w:rPr>
+              <w:fldChar w:fldCharType="end"/>
+            </w:r>
+          </w:hyperlink>
+        </w:p>
+        <w:p>
+          <w:pPr>
+            <w:pStyle w:val="TOC2"/>
+            <w:tabs>
+              <w:tab w:val="right" w:leader="dot" w:pos="9782"/>
+            </w:tabs>
+            <w:rPr>
+              <w:rFonts w:asciiTheme="minorHAnsi" w:hAnsiTheme="minorHAnsi"/>
+              <w:noProof/>
+              <w:kern w:val="2"/>
+              <w:sz w:val="24"/>
+              <w:szCs w:val="24"/>
+              <w14:ligatures w14:val="standardContextual"/>
+            </w:rPr>
+          </w:pPr>
+          <w:hyperlink w:anchor="_Toc234896723" w:history="1">
+            <w:r>
+              <w:rPr>
+                <w:rStyle w:val="Hyperlink"/>
+                <w:noProof/>
+              </w:rPr>
               <w:t>3. Open the Program</w:t>
             </w:r>
             <w:r>
@@ -473,7 +696,7 @@
                 <w:noProof/>
                 <w:webHidden/>
               </w:rPr>
-              <w:instrText xml:space="preserve"> PAGEREF _Toc234885131 \h </w:instrText>
+              <w:instrText xml:space="preserve"> PAGEREF _Toc234896723 \h </w:instrText>
             </w:r>
             <w:r>
               <w:rPr>
@@ -493,7 +716,7 @@
                 <w:noProof/>
                 <w:webHidden/>
               </w:rPr>
-              <w:t>2</w:t>
+              <w:t>3</w:t>
             </w:r>
             <w:r>
               <w:rPr>
@@ -519,7 +742,7 @@
               <w14:ligatures w14:val="standardContextual"/>
             </w:rPr>
           </w:pPr>
-          <w:hyperlink w:anchor="_Toc234885132" w:history="1">
+          <w:hyperlink w:anchor="_Toc234896724" w:history="1">
             <w:r>
               <w:rPr>
                 <w:rStyle w:val="Hyperlink"/>
@@ -546,7 +769,7 @@
                 <w:noProof/>
                 <w:webHidden/>
               </w:rPr>
-              <w:instrText xml:space="preserve"> PAGEREF _Toc234885132 \h </w:instrText>
+              <w:instrText xml:space="preserve"> PAGEREF _Toc234896724 \h </w:instrText>
             </w:r>
             <w:r>
               <w:rPr>
@@ -566,7 +789,7 @@
                 <w:noProof/>
                 <w:webHidden/>
               </w:rPr>
-              <w:t>2</w:t>
+              <w:t>3</w:t>
             </w:r>
             <w:r>
               <w:rPr>
@@ -592,7 +815,7 @@
               <w14:ligatures w14:val="standardContextual"/>
             </w:rPr>
           </w:pPr>
-          <w:hyperlink w:anchor="_Toc234885133" w:history="1">
+          <w:hyperlink w:anchor="_Toc234896725" w:history="1">
             <w:r>
               <w:rPr>
                 <w:rStyle w:val="Hyperlink"/>
@@ -619,7 +842,7 @@
                 <w:noProof/>
                 <w:webHidden/>
               </w:rPr>
-              <w:instrText xml:space="preserve"> PAGEREF _Toc234885133 \h </w:instrText>
+              <w:instrText xml:space="preserve"> PAGEREF _Toc234896725 \h </w:instrText>
             </w:r>
             <w:r>
               <w:rPr>
@@ -639,7 +862,7 @@
                 <w:noProof/>
                 <w:webHidden/>
               </w:rPr>
-              <w:t>2</w:t>
+              <w:t>3</w:t>
             </w:r>
             <w:r>
               <w:rPr>
@@ -665,7 +888,7 @@
               <w14:ligatures w14:val="standardContextual"/>
             </w:rPr>
           </w:pPr>
-          <w:hyperlink w:anchor="_Toc234885134" w:history="1">
+          <w:hyperlink w:anchor="_Toc234896726" w:history="1">
             <w:r>
               <w:rPr>
                 <w:rStyle w:val="Hyperlink"/>
@@ -692,7 +915,7 @@
                 <w:noProof/>
                 <w:webHidden/>
               </w:rPr>
-              <w:instrText xml:space="preserve"> PAGEREF _Toc234885134 \h </w:instrText>
+              <w:instrText xml:space="preserve"> PAGEREF _Toc234896726 \h </w:instrText>
             </w:r>
             <w:r>
               <w:rPr>
@@ -738,7 +961,7 @@
               <w14:ligatures w14:val="standardContextual"/>
             </w:rPr>
           </w:pPr>
-          <w:hyperlink w:anchor="_Toc234885135" w:history="1">
+          <w:hyperlink w:anchor="_Toc234896727" w:history="1">
             <w:r>
               <w:rPr>
                 <w:rStyle w:val="Hyperlink"/>
@@ -765,7 +988,7 @@
                 <w:noProof/>
                 <w:webHidden/>
               </w:rPr>
-              <w:instrText xml:space="preserve"> PAGEREF _Toc234885135 \h </w:instrText>
+              <w:instrText xml:space="preserve"> PAGEREF _Toc234896727 \h </w:instrText>
             </w:r>
             <w:r>
               <w:rPr>
@@ -811,7 +1034,7 @@
               <w14:ligatures w14:val="standardContextual"/>
             </w:rPr>
           </w:pPr>
-          <w:hyperlink w:anchor="_Toc234885136" w:history="1">
+          <w:hyperlink w:anchor="_Toc234896728" w:history="1">
             <w:r>
               <w:rPr>
                 <w:rStyle w:val="Hyperlink"/>
@@ -838,7 +1061,7 @@
                 <w:noProof/>
                 <w:webHidden/>
               </w:rPr>
-              <w:instrText xml:space="preserve"> PAGEREF _Toc234885136 \h </w:instrText>
+              <w:instrText xml:space="preserve"> PAGEREF _Toc234896728 \h </w:instrText>
             </w:r>
             <w:r>
               <w:rPr>
@@ -858,7 +1081,7 @@
                 <w:noProof/>
                 <w:webHidden/>
               </w:rPr>
-              <w:t>3</w:t>
+              <w:t>4</w:t>
             </w:r>
             <w:r>
               <w:rPr>
@@ -884,7 +1107,7 @@
               <w14:ligatures w14:val="standardContextual"/>
             </w:rPr>
           </w:pPr>
-          <w:hyperlink w:anchor="_Toc234885137" w:history="1">
+          <w:hyperlink w:anchor="_Toc234896729" w:history="1">
             <w:r>
               <w:rPr>
                 <w:rStyle w:val="Hyperlink"/>
@@ -911,7 +1134,7 @@
                 <w:noProof/>
                 <w:webHidden/>
               </w:rPr>
-              <w:instrText xml:space="preserve"> PAGEREF _Toc234885137 \h </w:instrText>
+              <w:instrText xml:space="preserve"> PAGEREF _Toc234896729 \h </w:instrText>
             </w:r>
             <w:r>
               <w:rPr>
@@ -931,7 +1154,7 @@
                 <w:noProof/>
                 <w:webHidden/>
               </w:rPr>
-              <w:t>3</w:t>
+              <w:t>4</w:t>
             </w:r>
             <w:r>
               <w:rPr>
@@ -957,7 +1180,7 @@
               <w14:ligatures w14:val="standardContextual"/>
             </w:rPr>
           </w:pPr>
-          <w:hyperlink w:anchor="_Toc234885138" w:history="1">
+          <w:hyperlink w:anchor="_Toc234896730" w:history="1">
             <w:r>
               <w:rPr>
                 <w:rStyle w:val="Hyperlink"/>
@@ -984,7 +1207,7 @@
                 <w:noProof/>
                 <w:webHidden/>
               </w:rPr>
-              <w:instrText xml:space="preserve"> PAGEREF _Toc234885138 \h </w:instrText>
+              <w:instrText xml:space="preserve"> PAGEREF _Toc234896730 \h </w:instrText>
             </w:r>
             <w:r>
               <w:rPr>
@@ -1030,7 +1253,7 @@
               <w14:ligatures w14:val="standardContextual"/>
             </w:rPr>
           </w:pPr>
-          <w:hyperlink w:anchor="_Toc234885139" w:history="1">
+          <w:hyperlink w:anchor="_Toc234896731" w:history="1">
             <w:r>
               <w:rPr>
                 <w:rStyle w:val="Hyperlink"/>
@@ -1057,7 +1280,7 @@
                 <w:noProof/>
                 <w:webHidden/>
               </w:rPr>
-              <w:instrText xml:space="preserve"> PAGEREF _Toc234885139 \h </w:instrText>
+              <w:instrText xml:space="preserve"> PAGEREF _Toc234896731 \h </w:instrText>
             </w:r>
             <w:r>
               <w:rPr>
@@ -1103,7 +1326,7 @@
               <w14:ligatures w14:val="standardContextual"/>
             </w:rPr>
           </w:pPr>
-          <w:hyperlink w:anchor="_Toc234885140" w:history="1">
+          <w:hyperlink w:anchor="_Toc234896732" w:history="1">
             <w:r>
               <w:rPr>
                 <w:rStyle w:val="Hyperlink"/>
@@ -1130,7 +1353,7 @@
                 <w:noProof/>
                 <w:webHidden/>
               </w:rPr>
-              <w:instrText xml:space="preserve"> PAGEREF _Toc234885140 \h </w:instrText>
+              <w:instrText xml:space="preserve"> PAGEREF _Toc234896732 \h </w:instrText>
             </w:r>
             <w:r>
               <w:rPr>
@@ -1150,7 +1373,7 @@
                 <w:noProof/>
                 <w:webHidden/>
               </w:rPr>
-              <w:t>4</w:t>
+              <w:t>5</w:t>
             </w:r>
             <w:r>
               <w:rPr>
@@ -1176,7 +1399,7 @@
               <w14:ligatures w14:val="standardContextual"/>
             </w:rPr>
           </w:pPr>
-          <w:hyperlink w:anchor="_Toc234885141" w:history="1">
+          <w:hyperlink w:anchor="_Toc234896733" w:history="1">
             <w:r>
               <w:rPr>
                 <w:rStyle w:val="Hyperlink"/>
@@ -1203,7 +1426,7 @@
                 <w:noProof/>
                 <w:webHidden/>
               </w:rPr>
-              <w:instrText xml:space="preserve"> PAGEREF _Toc234885141 \h </w:instrText>
+              <w:instrText xml:space="preserve"> PAGEREF _Toc234896733 \h </w:instrText>
             </w:r>
             <w:r>
               <w:rPr>
@@ -1223,7 +1446,7 @@
                 <w:noProof/>
                 <w:webHidden/>
               </w:rPr>
-              <w:t>4</w:t>
+              <w:t>5</w:t>
             </w:r>
             <w:r>
               <w:rPr>
@@ -1249,7 +1472,7 @@
               <w14:ligatures w14:val="standardContextual"/>
             </w:rPr>
           </w:pPr>
-          <w:hyperlink w:anchor="_Toc234885142" w:history="1">
+          <w:hyperlink w:anchor="_Toc234896734" w:history="1">
             <w:r>
               <w:rPr>
                 <w:rStyle w:val="Hyperlink"/>
@@ -1276,7 +1499,7 @@
                 <w:noProof/>
                 <w:webHidden/>
               </w:rPr>
-              <w:instrText xml:space="preserve"> PAGEREF _Toc234885142 \h </w:instrText>
+              <w:instrText xml:space="preserve"> PAGEREF _Toc234896734 \h </w:instrText>
             </w:r>
             <w:r>
               <w:rPr>
@@ -1296,7 +1519,7 @@
                 <w:noProof/>
                 <w:webHidden/>
               </w:rPr>
-              <w:t>4</w:t>
+              <w:t>5</w:t>
             </w:r>
             <w:r>
               <w:rPr>
@@ -1322,7 +1545,7 @@
               <w14:ligatures w14:val="standardContextual"/>
             </w:rPr>
           </w:pPr>
-          <w:hyperlink w:anchor="_Toc234885143" w:history="1">
+          <w:hyperlink w:anchor="_Toc234896735" w:history="1">
             <w:r>
               <w:rPr>
                 <w:rStyle w:val="Hyperlink"/>
@@ -1349,7 +1572,7 @@
                 <w:noProof/>
                 <w:webHidden/>
               </w:rPr>
-              <w:instrText xml:space="preserve"> PAGEREF _Toc234885143 \h </w:instrText>
+              <w:instrText xml:space="preserve"> PAGEREF _Toc234896735 \h </w:instrText>
             </w:r>
             <w:r>
               <w:rPr>
@@ -1369,7 +1592,7 @@
                 <w:noProof/>
                 <w:webHidden/>
               </w:rPr>
-              <w:t>4</w:t>
+              <w:t>5</w:t>
             </w:r>
             <w:r>
               <w:rPr>
@@ -1395,7 +1618,7 @@
               <w14:ligatures w14:val="standardContextual"/>
             </w:rPr>
           </w:pPr>
-          <w:hyperlink w:anchor="_Toc234885144" w:history="1">
+          <w:hyperlink w:anchor="_Toc234896736" w:history="1">
             <w:r>
               <w:rPr>
                 <w:rStyle w:val="Hyperlink"/>
@@ -1422,7 +1645,7 @@
                 <w:noProof/>
                 <w:webHidden/>
               </w:rPr>
-              <w:instrText xml:space="preserve"> PAGEREF _Toc234885144 \h </w:instrText>
+              <w:instrText xml:space="preserve"> PAGEREF _Toc234896736 \h </w:instrText>
             </w:r>
             <w:r>
               <w:rPr>
@@ -1468,7 +1691,7 @@
               <w14:ligatures w14:val="standardContextual"/>
             </w:rPr>
           </w:pPr>
-          <w:hyperlink w:anchor="_Toc234885145" w:history="1">
+          <w:hyperlink w:anchor="_Toc234896737" w:history="1">
             <w:r>
               <w:rPr>
                 <w:rStyle w:val="Hyperlink"/>
@@ -1495,7 +1718,7 @@
                 <w:noProof/>
                 <w:webHidden/>
               </w:rPr>
-              <w:instrText xml:space="preserve"> PAGEREF _Toc234885145 \h </w:instrText>
+              <w:instrText xml:space="preserve"> PAGEREF _Toc234896737 \h </w:instrText>
             </w:r>
             <w:r>
               <w:rPr>
@@ -1515,7 +1738,7 @@
                 <w:noProof/>
                 <w:webHidden/>
               </w:rPr>
-              <w:t>5</w:t>
+              <w:t>6</w:t>
             </w:r>
             <w:r>
               <w:rPr>
@@ -1542,8 +1765,9 @@
       <w:pPr>
         <w:pStyle w:val="Heading1"/>
       </w:pPr>
-      <w:bookmarkStart w:id="0" w:name="_Toc234885126"/>
-      <w:r>
+      <w:bookmarkStart w:id="0" w:name="_Toc234896715"/>
+      <w:r>
+        <w:lastRenderedPageBreak/>
         <w:t>What This Program Does</w:t>
       </w:r>
       <w:bookmarkEnd w:id="0"/>
@@ -1578,7 +1802,6 @@
         <w:spacing w:after="160"/>
       </w:pPr>
       <w:r>
-        <w:lastRenderedPageBreak/>
         <w:t xml:space="preserve">You save </w:t>
       </w:r>
       <w:proofErr w:type="gramStart"/>
@@ -1622,9 +1845,20 @@
     </w:p>
     <w:p>
       <w:pPr>
+        <w:spacing w:after="160"/>
+      </w:pPr>
+    </w:p>
+    <w:p>
+      <w:pPr>
         <w:pStyle w:val="Heading1"/>
       </w:pPr>
-      <w:bookmarkStart w:id="1" w:name="_Toc234885127"/>
+      <w:bookmarkStart w:id="1" w:name="_Toc234896716"/>
+      <w:r>
+        <w:t>P</w:t>
+      </w:r>
+      <w:r>
+        <w:t xml:space="preserve">ython </w:t>
+      </w:r>
       <w:r>
         <w:t>Installation Guide:</w:t>
       </w:r>
@@ -1634,11 +1868,399 @@
       <w:pPr>
         <w:pStyle w:val="Heading2"/>
       </w:pPr>
-      <w:bookmarkStart w:id="2" w:name="_Toc234885128"/>
+      <w:bookmarkStart w:id="2" w:name="_Toc234896717"/>
+      <w:r>
+        <w:t>1. C</w:t>
+      </w:r>
+      <w:r>
+        <w:t>heck if You Have Python Installed</w:t>
+      </w:r>
+      <w:bookmarkEnd w:id="2"/>
+    </w:p>
+    <w:p>
+      <w:pPr>
+        <w:spacing w:after="160"/>
+        <w:rPr>
+          <w:b/>
+          <w:bCs/>
+        </w:rPr>
+      </w:pPr>
+      <w:r>
+        <w:rPr>
+          <w:b/>
+          <w:bCs/>
+        </w:rPr>
+        <w:t xml:space="preserve">If </w:t>
+      </w:r>
+      <w:r>
+        <w:rPr>
+          <w:b/>
+          <w:bCs/>
+        </w:rPr>
+        <w:t xml:space="preserve">you already have a Python version equal to or greater than 3.9, skip </w:t>
+      </w:r>
+      <w:r>
+        <w:rPr>
+          <w:b/>
+          <w:bCs/>
+        </w:rPr>
+        <w:t>to the Program Installation Guide.</w:t>
+      </w:r>
+    </w:p>
+    <w:p>
+      <w:pPr>
+        <w:pStyle w:val="ListParagraph"/>
+        <w:numPr>
+          <w:ilvl w:val="0"/>
+          <w:numId w:val="16"/>
+        </w:numPr>
+        <w:spacing w:after="160"/>
+      </w:pPr>
+      <w:r>
+        <w:rPr>
+          <w:b/>
+          <w:bCs/>
+        </w:rPr>
+        <w:t xml:space="preserve">Win + R </w:t>
+      </w:r>
+      <w:r>
+        <w:t xml:space="preserve">-&gt; Type </w:t>
+      </w:r>
+      <w:proofErr w:type="spellStart"/>
+      <w:r>
+        <w:rPr>
+          <w:b/>
+          <w:bCs/>
+        </w:rPr>
+        <w:t>cmd</w:t>
+      </w:r>
+      <w:proofErr w:type="spellEnd"/>
+      <w:r>
+        <w:t xml:space="preserve"> and hit </w:t>
+      </w:r>
+      <w:r>
+        <w:rPr>
+          <w:b/>
+          <w:bCs/>
+        </w:rPr>
+        <w:t>Enter</w:t>
+      </w:r>
+      <w:r>
+        <w:t xml:space="preserve"> to open the command line</w:t>
+      </w:r>
+      <w:r>
+        <w:t xml:space="preserve"> -&gt; Try </w:t>
+      </w:r>
+      <w:r>
+        <w:t xml:space="preserve">these </w:t>
+      </w:r>
+      <w:r>
+        <w:t xml:space="preserve">two different commands: </w:t>
+      </w:r>
+    </w:p>
+    <w:p>
+      <w:pPr>
+        <w:pStyle w:val="ListParagraph"/>
+        <w:numPr>
+          <w:ilvl w:val="1"/>
+          <w:numId w:val="16"/>
+        </w:numPr>
+        <w:spacing w:after="160"/>
+      </w:pPr>
+      <w:r>
+        <w:t xml:space="preserve">Type </w:t>
+      </w:r>
+      <w:r>
+        <w:rPr>
+          <w:b/>
+          <w:bCs/>
+        </w:rPr>
+        <w:t xml:space="preserve">Py -V </w:t>
+      </w:r>
+      <w:r>
+        <w:t>into the command line</w:t>
+      </w:r>
+      <w:r>
+        <w:t xml:space="preserve"> and hit </w:t>
+      </w:r>
+      <w:r>
+        <w:rPr>
+          <w:b/>
+          <w:bCs/>
+        </w:rPr>
+        <w:t>Enter</w:t>
+      </w:r>
+      <w:r>
+        <w:t xml:space="preserve">. If a result </w:t>
+      </w:r>
+      <w:proofErr w:type="gramStart"/>
+      <w:r>
+        <w:t>wasn’t</w:t>
+      </w:r>
+      <w:proofErr w:type="gramEnd"/>
+      <w:r>
+        <w:t xml:space="preserve"> shown, try</w:t>
+      </w:r>
+      <w:r>
+        <w:t xml:space="preserve"> step</w:t>
+      </w:r>
+      <w:r>
+        <w:t xml:space="preserve"> b.</w:t>
+      </w:r>
+    </w:p>
+    <w:p>
+      <w:pPr>
+        <w:pStyle w:val="ListParagraph"/>
+        <w:numPr>
+          <w:ilvl w:val="1"/>
+          <w:numId w:val="16"/>
+        </w:numPr>
+        <w:spacing w:after="160"/>
+      </w:pPr>
+      <w:r>
+        <w:t xml:space="preserve">Type </w:t>
+      </w:r>
+      <w:r>
+        <w:rPr>
+          <w:b/>
+          <w:bCs/>
+        </w:rPr>
+        <w:t>p</w:t>
+      </w:r>
+      <w:r>
+        <w:rPr>
+          <w:b/>
+          <w:bCs/>
+        </w:rPr>
+        <w:t xml:space="preserve">ython </w:t>
+      </w:r>
+      <w:r>
+        <w:rPr>
+          <w:b/>
+          <w:bCs/>
+        </w:rPr>
+        <w:t>--</w:t>
+      </w:r>
+      <w:r>
+        <w:rPr>
+          <w:b/>
+          <w:bCs/>
+        </w:rPr>
+        <w:t xml:space="preserve">version </w:t>
+      </w:r>
+      <w:r>
+        <w:t xml:space="preserve">into the command line and hit </w:t>
+      </w:r>
+      <w:r>
+        <w:rPr>
+          <w:b/>
+          <w:bCs/>
+        </w:rPr>
+        <w:t>Enter</w:t>
+      </w:r>
+      <w:r>
+        <w:t xml:space="preserve">. </w:t>
+      </w:r>
+    </w:p>
+    <w:p>
+      <w:pPr>
+        <w:pStyle w:val="Heading2"/>
+      </w:pPr>
+      <w:bookmarkStart w:id="3" w:name="_Toc234896718"/>
+      <w:r>
+        <w:t>2</w:t>
+      </w:r>
+      <w:r>
+        <w:t xml:space="preserve">. </w:t>
+      </w:r>
+      <w:r>
+        <w:t>Install Python</w:t>
+      </w:r>
+      <w:bookmarkEnd w:id="3"/>
+    </w:p>
+    <w:p>
+      <w:pPr>
+        <w:spacing w:after="160"/>
+        <w:rPr>
+          <w:b/>
+          <w:bCs/>
+        </w:rPr>
+      </w:pPr>
+      <w:r>
+        <w:rPr>
+          <w:b/>
+          <w:bCs/>
+        </w:rPr>
+        <w:t>If you already have a Python version equal to or greater than 3.9, skip to the Program Installation Guide.</w:t>
+      </w:r>
+    </w:p>
+    <w:p>
+      <w:pPr>
+        <w:pStyle w:val="ListParagraph"/>
+        <w:numPr>
+          <w:ilvl w:val="0"/>
+          <w:numId w:val="17"/>
+        </w:numPr>
+        <w:spacing w:after="160"/>
+      </w:pPr>
+      <w:r>
+        <w:rPr>
+          <w:b/>
+          <w:bCs/>
+        </w:rPr>
+        <w:t xml:space="preserve">Win + R </w:t>
+      </w:r>
+      <w:r>
+        <w:t xml:space="preserve">-&gt; Type </w:t>
+      </w:r>
+      <w:proofErr w:type="spellStart"/>
+      <w:r>
+        <w:rPr>
+          <w:b/>
+          <w:bCs/>
+        </w:rPr>
+        <w:t>cmd</w:t>
+      </w:r>
+      <w:proofErr w:type="spellEnd"/>
+      <w:r>
+        <w:t xml:space="preserve"> and hit </w:t>
+      </w:r>
+      <w:r>
+        <w:rPr>
+          <w:b/>
+          <w:bCs/>
+        </w:rPr>
+        <w:t>Enter</w:t>
+      </w:r>
+      <w:r>
+        <w:t xml:space="preserve"> to open the command line -&gt; </w:t>
+      </w:r>
+      <w:r>
+        <w:t xml:space="preserve">Type </w:t>
+      </w:r>
+      <w:proofErr w:type="spellStart"/>
+      <w:r>
+        <w:rPr>
+          <w:b/>
+          <w:bCs/>
+        </w:rPr>
+        <w:t>winget</w:t>
+      </w:r>
+      <w:proofErr w:type="spellEnd"/>
+      <w:r>
+        <w:rPr>
+          <w:b/>
+          <w:bCs/>
+        </w:rPr>
+        <w:t xml:space="preserve"> install Python.Python.3.12</w:t>
+      </w:r>
+      <w:r>
+        <w:t xml:space="preserve"> into the command line and hit </w:t>
+      </w:r>
+      <w:r>
+        <w:rPr>
+          <w:b/>
+          <w:bCs/>
+        </w:rPr>
+        <w:t>Enter</w:t>
+      </w:r>
+      <w:r>
+        <w:rPr>
+          <w:b/>
+          <w:bCs/>
+        </w:rPr>
+        <w:t xml:space="preserve"> </w:t>
+      </w:r>
+      <w:r>
+        <w:t>-&gt; Wait for the installation window to complete. Python should now be downloaded.</w:t>
+      </w:r>
+    </w:p>
+    <w:p>
+      <w:pPr>
+        <w:pStyle w:val="ListParagraph"/>
+        <w:numPr>
+          <w:ilvl w:val="0"/>
+          <w:numId w:val="17"/>
+        </w:numPr>
+        <w:spacing w:after="160"/>
+      </w:pPr>
+      <w:r>
+        <w:t xml:space="preserve">To double check if Python is downloaded, go back to the command line -&gt; Type </w:t>
+      </w:r>
+      <w:proofErr w:type="spellStart"/>
+      <w:r>
+        <w:rPr>
+          <w:b/>
+          <w:bCs/>
+        </w:rPr>
+        <w:t>py</w:t>
+      </w:r>
+      <w:proofErr w:type="spellEnd"/>
+      <w:r>
+        <w:rPr>
+          <w:b/>
+          <w:bCs/>
+        </w:rPr>
+        <w:t xml:space="preserve"> -0</w:t>
+      </w:r>
+      <w:r>
+        <w:t xml:space="preserve"> into the command line and hit </w:t>
+      </w:r>
+      <w:r>
+        <w:rPr>
+          <w:b/>
+          <w:bCs/>
+        </w:rPr>
+        <w:t xml:space="preserve">Enter </w:t>
+      </w:r>
+      <w:r>
+        <w:t xml:space="preserve">-&gt; If you see </w:t>
+      </w:r>
+      <w:r>
+        <w:rPr>
+          <w:b/>
+          <w:bCs/>
+        </w:rPr>
+        <w:t>-V:3.12          Python 3.12 (64-bit)</w:t>
+      </w:r>
+      <w:r>
+        <w:rPr>
+          <w:b/>
+          <w:bCs/>
+        </w:rPr>
+        <w:t xml:space="preserve"> </w:t>
+      </w:r>
+      <w:proofErr w:type="gramStart"/>
+      <w:r>
+        <w:t>outputted</w:t>
+      </w:r>
+      <w:proofErr w:type="gramEnd"/>
+      <w:r>
+        <w:t xml:space="preserve"> then Python 3.12 is installed.</w:t>
+      </w:r>
+    </w:p>
+    <w:p>
+      <w:pPr>
+        <w:pStyle w:val="Heading1"/>
+      </w:pPr>
+      <w:bookmarkStart w:id="4" w:name="_Toc234896719"/>
+      <w:r>
+        <w:t xml:space="preserve">Program </w:t>
+      </w:r>
+      <w:r>
+        <w:t>Installation Guide:</w:t>
+      </w:r>
+      <w:bookmarkEnd w:id="4"/>
+    </w:p>
+    <w:p>
+      <w:pPr>
+        <w:pStyle w:val="Heading2"/>
+      </w:pPr>
+      <w:bookmarkStart w:id="5" w:name="_Toc234896720"/>
       <w:r>
         <w:t>Requirements:</w:t>
       </w:r>
-      <w:bookmarkEnd w:id="2"/>
+      <w:bookmarkEnd w:id="5"/>
       <w:r>
         <w:t xml:space="preserve"> </w:t>
       </w:r>
@@ -1687,14 +2309,11 @@
       <w:pPr>
         <w:pStyle w:val="Heading2"/>
       </w:pPr>
-      <w:bookmarkStart w:id="3" w:name="_Toc234885129"/>
-      <w:r>
-        <w:t xml:space="preserve">1. </w:t>
-      </w:r>
-      <w:r>
-        <w:t>Copy the Program Folder to Your Computer</w:t>
-      </w:r>
-      <w:bookmarkEnd w:id="3"/>
+      <w:bookmarkStart w:id="6" w:name="_Toc234896721"/>
+      <w:r>
+        <w:t>1. Copy the Program Folder to Your Computer</w:t>
+      </w:r>
+      <w:bookmarkEnd w:id="6"/>
     </w:p>
     <w:p>
       <w:pPr>
@@ -1765,7 +2384,36 @@
         <w:spacing w:after="160"/>
       </w:pPr>
       <w:r>
-        <w:t xml:space="preserve">Paste the project folder </w:t>
+        <w:t>Paste the project folder</w:t>
+      </w:r>
+      <w:r>
+        <w:t xml:space="preserve"> </w:t>
+      </w:r>
+      <w:r>
+        <w:rPr>
+          <w:b/>
+          <w:bCs/>
+        </w:rPr>
+        <w:t>Project Time Tracker</w:t>
+      </w:r>
+      <w:r>
+        <w:rPr>
+          <w:b/>
+          <w:bCs/>
+        </w:rPr>
+        <w:t xml:space="preserve"> </w:t>
+      </w:r>
+      <w:r>
+        <w:t>(</w:t>
+      </w:r>
+      <w:r>
+        <w:rPr>
+          <w:u w:val="single"/>
+        </w:rPr>
+        <w:t>NOT the ZIP folder)</w:t>
+      </w:r>
+      <w:r>
+        <w:t xml:space="preserve"> </w:t>
       </w:r>
       <w:r>
         <w:t xml:space="preserve">in an easily </w:t>
@@ -1781,24 +2429,34 @@
       <w:pPr>
         <w:pStyle w:val="Heading2"/>
       </w:pPr>
-      <w:bookmarkStart w:id="4" w:name="_Toc234885130"/>
-      <w:r>
-        <w:t>2</w:t>
-      </w:r>
-      <w:r>
-        <w:t xml:space="preserve">. </w:t>
-      </w:r>
-      <w:r>
-        <w:t>Install the Required Libraries</w:t>
-      </w:r>
-      <w:bookmarkEnd w:id="4"/>
+      <w:bookmarkStart w:id="7" w:name="_Toc234896722"/>
+      <w:r>
+        <w:lastRenderedPageBreak/>
+        <w:t>2. Install the Required Libraries</w:t>
+      </w:r>
+      <w:bookmarkEnd w:id="7"/>
     </w:p>
     <w:p>
       <w:pPr>
         <w:spacing w:after="160"/>
-      </w:pPr>
-      <w:r>
-        <w:t xml:space="preserve">This process has been reduced to a simple, user-friendly two-step process. </w:t>
+        <w:rPr>
+          <w:b/>
+          <w:bCs/>
+        </w:rPr>
+      </w:pPr>
+      <w:r>
+        <w:rPr>
+          <w:b/>
+          <w:bCs/>
+        </w:rPr>
+        <w:t xml:space="preserve">If at any point in this step </w:t>
+      </w:r>
+      <w:r>
+        <w:rPr>
+          <w:b/>
+          <w:bCs/>
+        </w:rPr>
+        <w:t>the setup.bat file crashes, you don’t have Python installed. Go back to the Python Installation Guide above.</w:t>
       </w:r>
     </w:p>
     <w:p>
@@ -1851,27 +2509,18 @@
       <w:pPr>
         <w:pStyle w:val="Heading2"/>
       </w:pPr>
-      <w:bookmarkStart w:id="5" w:name="_Toc234885131"/>
-      <w:r>
-        <w:t>3</w:t>
-      </w:r>
-      <w:r>
-        <w:t xml:space="preserve">. </w:t>
-      </w:r>
-      <w:r>
-        <w:t>Open the Program</w:t>
-      </w:r>
-      <w:bookmarkEnd w:id="5"/>
+      <w:bookmarkStart w:id="8" w:name="_Toc234896723"/>
+      <w:r>
+        <w:t>3. Open the Program</w:t>
+      </w:r>
+      <w:bookmarkEnd w:id="8"/>
     </w:p>
     <w:p>
       <w:pPr>
         <w:spacing w:after="160"/>
       </w:pPr>
       <w:r>
-        <w:t>T</w:t>
-      </w:r>
-      <w:r>
-        <w:t>est if the program works by opening it.</w:t>
+        <w:t>Test if the program works by opening it.</w:t>
       </w:r>
     </w:p>
     <w:p>
@@ -1905,42 +2554,33 @@
       <w:r>
         <w:t xml:space="preserve">No problems? </w:t>
       </w:r>
-      <w:proofErr w:type="gramStart"/>
       <w:r>
         <w:rPr>
           <w:b/>
           <w:bCs/>
         </w:rPr>
-        <w:t>Congrats</w:t>
-      </w:r>
-      <w:proofErr w:type="gramEnd"/>
-      <w:r>
-        <w:rPr>
-          <w:b/>
-          <w:bCs/>
-        </w:rPr>
-        <w:t xml:space="preserve">! You’re done! </w:t>
+        <w:t xml:space="preserve">Congrats! You’re done! </w:t>
       </w:r>
     </w:p>
     <w:p>
       <w:pPr>
         <w:pStyle w:val="Heading1"/>
       </w:pPr>
-      <w:bookmarkStart w:id="6" w:name="_Toc234885132"/>
+      <w:bookmarkStart w:id="9" w:name="_Toc234896724"/>
       <w:r>
         <w:t>Setup and Usage Guide:</w:t>
       </w:r>
-      <w:bookmarkEnd w:id="6"/>
+      <w:bookmarkEnd w:id="9"/>
     </w:p>
     <w:p>
       <w:pPr>
         <w:pStyle w:val="Heading2"/>
       </w:pPr>
-      <w:bookmarkStart w:id="7" w:name="_Toc234885133"/>
+      <w:bookmarkStart w:id="10" w:name="_Toc234896725"/>
       <w:r>
         <w:t>1. Set Up Your Profile (First Time Only)</w:t>
       </w:r>
-      <w:bookmarkEnd w:id="7"/>
+      <w:bookmarkEnd w:id="10"/>
     </w:p>
     <w:p>
       <w:pPr>
@@ -1968,10 +2608,7 @@
         <w:t>Options</w:t>
       </w:r>
       <w:r>
-        <w:t xml:space="preserve"> in the top </w:t>
-      </w:r>
-      <w:r>
-        <w:t xml:space="preserve">toolbar, then choose </w:t>
+        <w:t xml:space="preserve"> in the top toolbar, then choose </w:t>
       </w:r>
       <w:r>
         <w:rPr>
@@ -2052,12 +2689,11 @@
       <w:pPr>
         <w:pStyle w:val="Heading2"/>
       </w:pPr>
-      <w:bookmarkStart w:id="8" w:name="_Toc234885134"/>
-      <w:r>
-        <w:lastRenderedPageBreak/>
+      <w:bookmarkStart w:id="11" w:name="_Toc234896726"/>
+      <w:r>
         <w:t>2. Create a Database</w:t>
       </w:r>
-      <w:bookmarkEnd w:id="8"/>
+      <w:bookmarkEnd w:id="11"/>
     </w:p>
     <w:p>
       <w:pPr>
@@ -2088,14 +2724,7 @@
           <w:b/>
           <w:bCs/>
         </w:rPr>
-        <w:t>one before you can add pro</w:t>
-      </w:r>
-      <w:r>
-        <w:rPr>
-          <w:b/>
-          <w:bCs/>
-        </w:rPr>
-        <w:t>ject timers.</w:t>
+        <w:t>one before you can add project timers.</w:t>
       </w:r>
       <w:r>
         <w:rPr>
@@ -2307,11 +2936,11 @@
       <w:pPr>
         <w:pStyle w:val="Heading2"/>
       </w:pPr>
-      <w:bookmarkStart w:id="9" w:name="_Toc234885135"/>
+      <w:bookmarkStart w:id="12" w:name="_Toc234896727"/>
       <w:r>
         <w:t>3. Open an Existing Database</w:t>
       </w:r>
-      <w:bookmarkEnd w:id="9"/>
+      <w:bookmarkEnd w:id="12"/>
     </w:p>
     <w:p>
       <w:pPr>
@@ -2339,6 +2968,7 @@
         <w:spacing w:after="80"/>
       </w:pPr>
       <w:r>
+        <w:lastRenderedPageBreak/>
         <w:t xml:space="preserve">Click </w:t>
       </w:r>
       <w:r>
@@ -2360,10 +2990,7 @@
         <w:spacing w:after="80"/>
       </w:pPr>
       <w:r>
-        <w:t>Your project timers reload automa</w:t>
-      </w:r>
-      <w:r>
-        <w:t>tically with their original names.</w:t>
+        <w:t>Your project timers reload automatically with their original names.</w:t>
       </w:r>
     </w:p>
     <w:p>
@@ -2411,14 +3038,11 @@
       <w:pPr>
         <w:pStyle w:val="Heading2"/>
       </w:pPr>
-      <w:bookmarkStart w:id="10" w:name="_Toc234885136"/>
-      <w:r>
-        <w:t xml:space="preserve">4. </w:t>
-      </w:r>
-      <w:r>
-        <w:t>Add a Project Timer</w:t>
-      </w:r>
-      <w:bookmarkEnd w:id="10"/>
+      <w:bookmarkStart w:id="13" w:name="_Toc234896728"/>
+      <w:r>
+        <w:t>4. Add a Project Timer</w:t>
+      </w:r>
+      <w:bookmarkEnd w:id="13"/>
     </w:p>
     <w:p>
       <w:pPr>
@@ -2470,10 +3094,7 @@
         <w:spacing w:after="80"/>
       </w:pPr>
       <w:r>
-        <w:t>C</w:t>
-      </w:r>
-      <w:r>
-        <w:t xml:space="preserve">lick </w:t>
+        <w:t xml:space="preserve">Click </w:t>
       </w:r>
       <w:r>
         <w:rPr>
@@ -2494,10 +3115,7 @@
         <w:spacing w:after="80"/>
       </w:pPr>
       <w:r>
-        <w:t>Enter the project name and project number, separated by a comma — for exa</w:t>
-      </w:r>
-      <w:r>
-        <w:t xml:space="preserve">mple: </w:t>
+        <w:t xml:space="preserve">Enter the project name and project number, separated by a comma — for example: </w:t>
       </w:r>
       <w:proofErr w:type="spellStart"/>
       <w:r>
@@ -2546,11 +3164,11 @@
       <w:pPr>
         <w:pStyle w:val="Heading2"/>
       </w:pPr>
-      <w:bookmarkStart w:id="11" w:name="_Toc234885137"/>
+      <w:bookmarkStart w:id="14" w:name="_Toc234896729"/>
       <w:r>
         <w:t>5. Track Your Time</w:t>
       </w:r>
-      <w:bookmarkEnd w:id="11"/>
+      <w:bookmarkEnd w:id="14"/>
     </w:p>
     <w:p>
       <w:pPr>
@@ -2644,14 +3262,7 @@
           <w:color w:val="555555"/>
           <w:sz w:val="18"/>
         </w:rPr>
-        <w:t>Only one timer can run at a time. While a timer is run</w:t>
-      </w:r>
-      <w:r>
-        <w:rPr>
-          <w:color w:val="555555"/>
-          <w:sz w:val="18"/>
-        </w:rPr>
-        <w:t xml:space="preserve">ning, every other button and timer in the program is locked until you stop it — this prevents accidentally starting a second timer or saving </w:t>
+        <w:t xml:space="preserve">Only one timer can run at a time. While a timer is running, every other button and timer in the program is locked until you stop it — this prevents accidentally starting a second timer or saving </w:t>
       </w:r>
       <w:r>
         <w:rPr>
@@ -2679,15 +3290,11 @@
       <w:pPr>
         <w:pStyle w:val="Heading2"/>
       </w:pPr>
-      <w:bookmarkStart w:id="12" w:name="_Toc234885138"/>
-      <w:r>
-        <w:lastRenderedPageBreak/>
-        <w:t xml:space="preserve">6. </w:t>
-      </w:r>
-      <w:r>
-        <w:t>Check Today's Data</w:t>
-      </w:r>
-      <w:bookmarkEnd w:id="12"/>
+      <w:bookmarkStart w:id="15" w:name="_Toc234896730"/>
+      <w:r>
+        <w:t>6. Check Today's Data</w:t>
+      </w:r>
+      <w:bookmarkEnd w:id="15"/>
     </w:p>
     <w:p>
       <w:pPr>
@@ -2804,14 +3411,14 @@
       <w:pPr>
         <w:pStyle w:val="Heading2"/>
       </w:pPr>
-      <w:bookmarkStart w:id="13" w:name="_Toc234885139"/>
+      <w:bookmarkStart w:id="16" w:name="_Toc234896731"/>
       <w:r>
         <w:t>7</w:t>
       </w:r>
       <w:r>
         <w:t>. Save Your Time to the Database</w:t>
       </w:r>
-      <w:bookmarkEnd w:id="13"/>
+      <w:bookmarkEnd w:id="16"/>
     </w:p>
     <w:p>
       <w:pPr>
@@ -2836,10 +3443,7 @@
         <w:spacing w:after="80"/>
       </w:pPr>
       <w:r>
-        <w:t>C</w:t>
-      </w:r>
-      <w:r>
-        <w:t xml:space="preserve">lick </w:t>
+        <w:t xml:space="preserve">Click </w:t>
       </w:r>
       <w:r>
         <w:rPr>
@@ -2873,14 +3477,8 @@
           <w:color w:val="555555"/>
           <w:sz w:val="18"/>
         </w:rPr>
-        <w:t>Do this as often as you like —</w:t>
-      </w:r>
-      <w:r>
-        <w:rPr>
-          <w:color w:val="555555"/>
-          <w:sz w:val="18"/>
-        </w:rPr>
-        <w:t xml:space="preserve"> clicking Update Database repeatedly on the same day a</w:t>
+        <w:lastRenderedPageBreak/>
+        <w:t>Do this as often as you like — clicking Update Database repeatedly on the same day a</w:t>
       </w:r>
       <w:r>
         <w:rPr>
@@ -2901,11 +3499,11 @@
       <w:pPr>
         <w:pStyle w:val="Heading2"/>
       </w:pPr>
-      <w:bookmarkStart w:id="14" w:name="_Toc234885140"/>
+      <w:bookmarkStart w:id="17" w:name="_Toc234896732"/>
       <w:r>
         <w:t>8. Delete a Project Timer</w:t>
       </w:r>
-      <w:bookmarkEnd w:id="14"/>
+      <w:bookmarkEnd w:id="17"/>
     </w:p>
     <w:p>
       <w:pPr>
@@ -3038,14 +3636,11 @@
       <w:pPr>
         <w:pStyle w:val="Heading2"/>
       </w:pPr>
-      <w:bookmarkStart w:id="15" w:name="_Toc234885141"/>
-      <w:r>
-        <w:t>9. Closing t</w:t>
-      </w:r>
-      <w:r>
-        <w:t>he Program</w:t>
-      </w:r>
-      <w:bookmarkEnd w:id="15"/>
+      <w:bookmarkStart w:id="18" w:name="_Toc234896733"/>
+      <w:r>
+        <w:t>9. Closing the Program</w:t>
+      </w:r>
+      <w:bookmarkEnd w:id="18"/>
     </w:p>
     <w:p>
       <w:pPr>
@@ -3068,21 +3663,21 @@
       <w:pPr>
         <w:pStyle w:val="Heading1"/>
       </w:pPr>
-      <w:bookmarkStart w:id="16" w:name="_Toc234885142"/>
+      <w:bookmarkStart w:id="19" w:name="_Toc234896734"/>
       <w:r>
         <w:t>Adding Program to Taskbar</w:t>
       </w:r>
-      <w:bookmarkEnd w:id="16"/>
+      <w:bookmarkEnd w:id="19"/>
     </w:p>
     <w:p>
       <w:pPr>
         <w:pStyle w:val="Heading2"/>
       </w:pPr>
-      <w:bookmarkStart w:id="17" w:name="_Toc234885143"/>
+      <w:bookmarkStart w:id="20" w:name="_Toc234896735"/>
       <w:r>
         <w:t>Create a Shortcut and Add to Taskbar</w:t>
       </w:r>
-      <w:bookmarkEnd w:id="17"/>
+      <w:bookmarkEnd w:id="20"/>
     </w:p>
     <w:p>
       <w:pPr>
@@ -3216,7 +3811,6 @@
           <w:b/>
           <w:bCs/>
         </w:rPr>
-        <w:lastRenderedPageBreak/>
         <w:t>Ex. explorer “C:\Your\Path”</w:t>
       </w:r>
     </w:p>
@@ -3255,11 +3849,11 @@
       <w:pPr>
         <w:pStyle w:val="Heading1"/>
       </w:pPr>
-      <w:bookmarkStart w:id="18" w:name="_Toc234885144"/>
+      <w:bookmarkStart w:id="21" w:name="_Toc234896736"/>
       <w:r>
         <w:t>Quick Reference</w:t>
       </w:r>
-      <w:bookmarkEnd w:id="18"/>
+      <w:bookmarkEnd w:id="21"/>
     </w:p>
     <w:tbl>
       <w:tblPr>
@@ -3468,6 +4062,7 @@
               <w:rPr>
                 <w:sz w:val="19"/>
               </w:rPr>
+              <w:lastRenderedPageBreak/>
               <w:t>Update Database</w:t>
             </w:r>
           </w:p>
@@ -3522,13 +4117,7 @@
               <w:rPr>
                 <w:sz w:val="19"/>
               </w:rPr>
-              <w:t>Opt</w:t>
-            </w:r>
-            <w:r>
-              <w:rPr>
-                <w:sz w:val="19"/>
-              </w:rPr>
-              <w:t>ions → Profile</w:t>
+              <w:t>Options → Profile</w:t>
             </w:r>
           </w:p>
         </w:tc>
@@ -3647,11 +4236,11 @@
       <w:pPr>
         <w:pStyle w:val="Heading1"/>
       </w:pPr>
-      <w:bookmarkStart w:id="19" w:name="_Toc234885145"/>
+      <w:bookmarkStart w:id="22" w:name="_Toc234896737"/>
       <w:r>
         <w:t>Troubleshooting</w:t>
       </w:r>
-      <w:bookmarkEnd w:id="19"/>
+      <w:bookmarkEnd w:id="22"/>
     </w:p>
     <w:p>
       <w:pPr>
@@ -3676,13 +4265,7 @@
         <w:rPr>
           <w:i/>
         </w:rPr>
-        <w:t>pip install</w:t>
-      </w:r>
-      <w:r>
-        <w:rPr>
-          <w:i/>
-        </w:rPr>
-        <w:t xml:space="preserve"> tzdata</w:t>
+        <w:t>pip install tzdata</w:t>
       </w:r>
       <w:r>
         <w:t>, then restart the program.</w:t>
@@ -3717,14 +4300,7 @@
           <w:b/>
           <w:color w:val="2E2E2E"/>
         </w:rPr>
-        <w:t>No time</w:t>
-      </w:r>
-      <w:r>
-        <w:rPr>
-          <w:b/>
-          <w:color w:val="2E2E2E"/>
-        </w:rPr>
-        <w:t>rs appeared after Load Database</w:t>
+        <w:t>No timers appeared after Load Database</w:t>
       </w:r>
     </w:p>
     <w:p>
@@ -4009,7 +4585,6 @@
     <w:lvl w:ilvl="0">
       <w:start w:val="1"/>
       <w:numFmt w:val="bullet"/>
-      <w:pStyle w:val="ListBullet"/>
       <w:lvlText w:val=""/>
       <w:lvlJc w:val="left"/>
       <w:pPr>
@@ -4113,6 +4688,95 @@
     </w:lvl>
   </w:abstractNum>
   <w:abstractNum w:abstractNumId="10" w15:restartNumberingAfterBreak="0">
+    <w:nsid w:val="23DD7F17"/>
+    <w:multiLevelType w:val="hybridMultilevel"/>
+    <w:tmpl w:val="230A9EE6"/>
+    <w:lvl w:ilvl="0" w:tplc="0409000F">
+      <w:start w:val="1"/>
+      <w:numFmt w:val="decimal"/>
+      <w:lvlText w:val="%1."/>
+      <w:lvlJc w:val="left"/>
+      <w:pPr>
+        <w:ind w:left="720" w:hanging="360"/>
+      </w:pPr>
+      <w:rPr>
+        <w:rFonts w:hint="default"/>
+      </w:rPr>
+    </w:lvl>
+    <w:lvl w:ilvl="1" w:tplc="04090019">
+      <w:start w:val="1"/>
+      <w:numFmt w:val="lowerLetter"/>
+      <w:lvlText w:val="%2."/>
+      <w:lvlJc w:val="left"/>
+      <w:pPr>
+        <w:ind w:left="1440" w:hanging="360"/>
+      </w:pPr>
+    </w:lvl>
+    <w:lvl w:ilvl="2" w:tplc="0409001B" w:tentative="1">
+      <w:start w:val="1"/>
+      <w:numFmt w:val="lowerRoman"/>
+      <w:lvlText w:val="%3."/>
+      <w:lvlJc w:val="right"/>
+      <w:pPr>
+        <w:ind w:left="2160" w:hanging="180"/>
+      </w:pPr>
+    </w:lvl>
+    <w:lvl w:ilvl="3" w:tplc="0409000F" w:tentative="1">
+      <w:start w:val="1"/>
+      <w:numFmt w:val="decimal"/>
+      <w:lvlText w:val="%4."/>
+      <w:lvlJc w:val="left"/>
+      <w:pPr>
+        <w:ind w:left="2880" w:hanging="360"/>
+      </w:pPr>
+    </w:lvl>
+    <w:lvl w:ilvl="4" w:tplc="04090019" w:tentative="1">
+      <w:start w:val="1"/>
+      <w:numFmt w:val="lowerLetter"/>
+      <w:lvlText w:val="%5."/>
+      <w:lvlJc w:val="left"/>
+      <w:pPr>
+        <w:ind w:left="3600" w:hanging="360"/>
+      </w:pPr>
+    </w:lvl>
+    <w:lvl w:ilvl="5" w:tplc="0409001B" w:tentative="1">
+      <w:start w:val="1"/>
+      <w:numFmt w:val="lowerRoman"/>
+      <w:lvlText w:val="%6."/>
+      <w:lvlJc w:val="right"/>
+      <w:pPr>
+        <w:ind w:left="4320" w:hanging="180"/>
+      </w:pPr>
+    </w:lvl>
+    <w:lvl w:ilvl="6" w:tplc="0409000F" w:tentative="1">
+      <w:start w:val="1"/>
+      <w:numFmt w:val="decimal"/>
+      <w:lvlText w:val="%7."/>
+      <w:lvlJc w:val="left"/>
+      <w:pPr>
+        <w:ind w:left="5040" w:hanging="360"/>
+      </w:pPr>
+    </w:lvl>
+    <w:lvl w:ilvl="7" w:tplc="04090019" w:tentative="1">
+      <w:start w:val="1"/>
+      <w:numFmt w:val="lowerLetter"/>
+      <w:lvlText w:val="%8."/>
+      <w:lvlJc w:val="left"/>
+      <w:pPr>
+        <w:ind w:left="5760" w:hanging="360"/>
+      </w:pPr>
+    </w:lvl>
+    <w:lvl w:ilvl="8" w:tplc="0409001B" w:tentative="1">
+      <w:start w:val="1"/>
+      <w:numFmt w:val="lowerRoman"/>
+      <w:lvlText w:val="%9."/>
+      <w:lvlJc w:val="right"/>
+      <w:pPr>
+        <w:ind w:left="6480" w:hanging="180"/>
+      </w:pPr>
+    </w:lvl>
+  </w:abstractNum>
+  <w:abstractNum w:abstractNumId="11" w15:restartNumberingAfterBreak="0">
     <w:nsid w:val="471940AF"/>
     <w:multiLevelType w:val="hybridMultilevel"/>
     <w:tmpl w:val="F5288F5A"/>
@@ -4225,7 +4889,7 @@
       </w:rPr>
     </w:lvl>
   </w:abstractNum>
-  <w:abstractNum w:abstractNumId="11" w15:restartNumberingAfterBreak="0">
+  <w:abstractNum w:abstractNumId="12" w15:restartNumberingAfterBreak="0">
     <w:nsid w:val="58F15EC9"/>
     <w:multiLevelType w:val="multilevel"/>
     <w:tmpl w:val="2B12B8B8"/>
@@ -4280,7 +4944,7 @@
       <w:lvlJc w:val="left"/>
     </w:lvl>
   </w:abstractNum>
-  <w:abstractNum w:abstractNumId="12" w15:restartNumberingAfterBreak="0">
+  <w:abstractNum w:abstractNumId="13" w15:restartNumberingAfterBreak="0">
     <w:nsid w:val="595A28F5"/>
     <w:multiLevelType w:val="hybridMultilevel"/>
     <w:tmpl w:val="59BE24CA"/>
@@ -4369,7 +5033,7 @@
       </w:pPr>
     </w:lvl>
   </w:abstractNum>
-  <w:abstractNum w:abstractNumId="13" w15:restartNumberingAfterBreak="0">
+  <w:abstractNum w:abstractNumId="14" w15:restartNumberingAfterBreak="0">
     <w:nsid w:val="59E975FD"/>
     <w:multiLevelType w:val="hybridMultilevel"/>
     <w:tmpl w:val="381CD590"/>
@@ -4482,7 +5146,96 @@
       </w:rPr>
     </w:lvl>
   </w:abstractNum>
-  <w:abstractNum w:abstractNumId="14" w15:restartNumberingAfterBreak="0">
+  <w:abstractNum w:abstractNumId="15" w15:restartNumberingAfterBreak="0">
+    <w:nsid w:val="79102530"/>
+    <w:multiLevelType w:val="hybridMultilevel"/>
+    <w:tmpl w:val="230A9EE6"/>
+    <w:lvl w:ilvl="0" w:tplc="FFFFFFFF">
+      <w:start w:val="1"/>
+      <w:numFmt w:val="decimal"/>
+      <w:lvlText w:val="%1."/>
+      <w:lvlJc w:val="left"/>
+      <w:pPr>
+        <w:ind w:left="720" w:hanging="360"/>
+      </w:pPr>
+      <w:rPr>
+        <w:rFonts w:hint="default"/>
+      </w:rPr>
+    </w:lvl>
+    <w:lvl w:ilvl="1" w:tplc="FFFFFFFF">
+      <w:start w:val="1"/>
+      <w:numFmt w:val="lowerLetter"/>
+      <w:lvlText w:val="%2."/>
+      <w:lvlJc w:val="left"/>
+      <w:pPr>
+        <w:ind w:left="1440" w:hanging="360"/>
+      </w:pPr>
+    </w:lvl>
+    <w:lvl w:ilvl="2" w:tplc="FFFFFFFF" w:tentative="1">
+      <w:start w:val="1"/>
+      <w:numFmt w:val="lowerRoman"/>
+      <w:lvlText w:val="%3."/>
+      <w:lvlJc w:val="right"/>
+      <w:pPr>
+        <w:ind w:left="2160" w:hanging="180"/>
+      </w:pPr>
+    </w:lvl>
+    <w:lvl w:ilvl="3" w:tplc="FFFFFFFF" w:tentative="1">
+      <w:start w:val="1"/>
+      <w:numFmt w:val="decimal"/>
+      <w:lvlText w:val="%4."/>
+      <w:lvlJc w:val="left"/>
+      <w:pPr>
+        <w:ind w:left="2880" w:hanging="360"/>
+      </w:pPr>
+    </w:lvl>
+    <w:lvl w:ilvl="4" w:tplc="FFFFFFFF" w:tentative="1">
+      <w:start w:val="1"/>
+      <w:numFmt w:val="lowerLetter"/>
+      <w:lvlText w:val="%5."/>
+      <w:lvlJc w:val="left"/>
+      <w:pPr>
+        <w:ind w:left="3600" w:hanging="360"/>
+      </w:pPr>
+    </w:lvl>
+    <w:lvl w:ilvl="5" w:tplc="FFFFFFFF" w:tentative="1">
+      <w:start w:val="1"/>
+      <w:numFmt w:val="lowerRoman"/>
+      <w:lvlText w:val="%6."/>
+      <w:lvlJc w:val="right"/>
+      <w:pPr>
+        <w:ind w:left="4320" w:hanging="180"/>
+      </w:pPr>
+    </w:lvl>
+    <w:lvl w:ilvl="6" w:tplc="FFFFFFFF" w:tentative="1">
+      <w:start w:val="1"/>
+      <w:numFmt w:val="decimal"/>
+      <w:lvlText w:val="%7."/>
+      <w:lvlJc w:val="left"/>
+      <w:pPr>
+        <w:ind w:left="5040" w:hanging="360"/>
+      </w:pPr>
+    </w:lvl>
+    <w:lvl w:ilvl="7" w:tplc="FFFFFFFF" w:tentative="1">
+      <w:start w:val="1"/>
+      <w:numFmt w:val="lowerLetter"/>
+      <w:lvlText w:val="%8."/>
+      <w:lvlJc w:val="left"/>
+      <w:pPr>
+        <w:ind w:left="5760" w:hanging="360"/>
+      </w:pPr>
+    </w:lvl>
+    <w:lvl w:ilvl="8" w:tplc="FFFFFFFF" w:tentative="1">
+      <w:start w:val="1"/>
+      <w:numFmt w:val="lowerRoman"/>
+      <w:lvlText w:val="%9."/>
+      <w:lvlJc w:val="right"/>
+      <w:pPr>
+        <w:ind w:left="6480" w:hanging="180"/>
+      </w:pPr>
+    </w:lvl>
+  </w:abstractNum>
+  <w:abstractNum w:abstractNumId="16" w15:restartNumberingAfterBreak="0">
     <w:nsid w:val="7A276CCE"/>
     <w:multiLevelType w:val="hybridMultilevel"/>
     <w:tmpl w:val="7896901C"/>
@@ -4572,43 +5325,43 @@
     </w:lvl>
   </w:abstractNum>
   <w:num w:numId="1" w16cid:durableId="631786192">
-    <w:abstractNumId w:val="11"/>
+    <w:abstractNumId w:val="12"/>
     <w:lvlOverride w:ilvl="0">
       <w:startOverride w:val="1"/>
     </w:lvlOverride>
   </w:num>
   <w:num w:numId="2" w16cid:durableId="329916981">
-    <w:abstractNumId w:val="11"/>
+    <w:abstractNumId w:val="12"/>
     <w:lvlOverride w:ilvl="0">
       <w:startOverride w:val="1"/>
     </w:lvlOverride>
   </w:num>
   <w:num w:numId="3" w16cid:durableId="995033890">
-    <w:abstractNumId w:val="11"/>
+    <w:abstractNumId w:val="12"/>
     <w:lvlOverride w:ilvl="0">
       <w:startOverride w:val="1"/>
     </w:lvlOverride>
   </w:num>
   <w:num w:numId="4" w16cid:durableId="426652658">
-    <w:abstractNumId w:val="11"/>
+    <w:abstractNumId w:val="12"/>
     <w:lvlOverride w:ilvl="0">
       <w:startOverride w:val="1"/>
     </w:lvlOverride>
   </w:num>
   <w:num w:numId="5" w16cid:durableId="118299692">
-    <w:abstractNumId w:val="11"/>
+    <w:abstractNumId w:val="12"/>
     <w:lvlOverride w:ilvl="0">
       <w:startOverride w:val="1"/>
     </w:lvlOverride>
   </w:num>
   <w:num w:numId="6" w16cid:durableId="1104618074">
-    <w:abstractNumId w:val="11"/>
+    <w:abstractNumId w:val="12"/>
     <w:lvlOverride w:ilvl="0">
       <w:startOverride w:val="1"/>
     </w:lvlOverride>
   </w:num>
   <w:num w:numId="7" w16cid:durableId="1867526186">
-    <w:abstractNumId w:val="11"/>
+    <w:abstractNumId w:val="12"/>
     <w:lvlOverride w:ilvl="0">
       <w:startOverride w:val="1"/>
     </w:lvlOverride>
@@ -4617,7 +5370,7 @@
     <w:abstractNumId w:val="8"/>
   </w:num>
   <w:num w:numId="9" w16cid:durableId="1964724215">
-    <w:abstractNumId w:val="11"/>
+    <w:abstractNumId w:val="12"/>
     <w:lvlOverride w:ilvl="0">
       <w:startOverride w:val="1"/>
     </w:lvlOverride>
@@ -4634,22 +5387,28 @@
     <w:abstractNumId w:val="9"/>
   </w:num>
   <w:num w:numId="11" w16cid:durableId="1933275824">
-    <w:abstractNumId w:val="14"/>
+    <w:abstractNumId w:val="16"/>
   </w:num>
   <w:num w:numId="12" w16cid:durableId="1174219876">
-    <w:abstractNumId w:val="12"/>
+    <w:abstractNumId w:val="13"/>
   </w:num>
   <w:num w:numId="13" w16cid:durableId="918488214">
-    <w:abstractNumId w:val="11"/>
+    <w:abstractNumId w:val="12"/>
     <w:lvlOverride w:ilvl="0">
       <w:startOverride w:val="1"/>
     </w:lvlOverride>
   </w:num>
   <w:num w:numId="14" w16cid:durableId="406927996">
+    <w:abstractNumId w:val="11"/>
+  </w:num>
+  <w:num w:numId="15" w16cid:durableId="653490179">
+    <w:abstractNumId w:val="14"/>
+  </w:num>
+  <w:num w:numId="16" w16cid:durableId="1608586931">
     <w:abstractNumId w:val="10"/>
   </w:num>
-  <w:num w:numId="15" w16cid:durableId="653490179">
-    <w:abstractNumId w:val="13"/>
+  <w:num w:numId="17" w16cid:durableId="1446652276">
+    <w:abstractNumId w:val="15"/>
   </w:num>
 </w:numbering>
 </file>
@@ -5043,7 +5802,7 @@
   <w:style w:type="paragraph" w:default="1" w:styleId="Normal">
     <w:name w:val="Normal"/>
     <w:qFormat/>
-    <w:rsid w:val="006D50A8"/>
+    <w:rsid w:val="00744AFB"/>
     <w:rPr>
       <w:rFonts w:ascii="Calibri" w:hAnsi="Calibri"/>
       <w:sz w:val="21"/>

</xml_diff>